<commit_message>
fix: resolve bugs from 5th audit report (NaN collapse, DP accountant, UI, RedTeam module)
- DP Trainer: Added NaN/Inf loss and gradient guards to fail fast instead of saving corrupted models.
- DP Accountant: Fixed over-accounting (incrementing per tier instead of per batch).
- Adaptive Schedule: Now uses min batch timestep to maintain conservative RDP composition.
- Encoders/Missingness: Fixed silent clipping and string-cast imputation bugs.
- Risk Tiers: Fixed order-dependent correlation promotion bug.
- Kaggle Runner: Fixed metadata boolean strings and push directory logic.
- UI: Added RedTeam panel and pipeline checklist components.
- Added smoke test suites.
</commit_message>
<xml_diff>
--- a/docs/Phase10_Capstone_Report.docx
+++ b/docs/Phase10_Capstone_Report.docx
@@ -4,46 +4,93 @@
   <w:body>
     <w:p>
       <w:r>
-        <w:t># Phase 10: Capstone Evaluation Report</w:t>
-        <w:br/>
-        <w:br/>
-        <w:t>## 1. Executive Summary</w:t>
-        <w:br/>
-        <w:br/>
-        <w:t xml:space="preserve">This report encapsulates the successful deployment of a Differentially Private synthetic data generation pipeline. The project crafted a sophscientific data preprocessing system, adeptly addressed missing data, and utilized a Diffusion-based generative model guarded by Opacus. </w:t>
-        <w:br/>
-        <w:br/>
-        <w:t>## 2. Utility &amp; Privacy Evaluation (Phase 8)</w:t>
-        <w:br/>
-        <w:br/>
+        <w:t>Phase 10: Capstone Evaluation Report</w:t>
+      </w:r>
+    </w:p>
+    <w:p>
+      <w:pPr>
+        <w:pStyle w:val="ListNumber"/>
+      </w:pPr>
+      <w:r>
+        <w:t>1. Executive Summary</w:t>
+      </w:r>
+    </w:p>
+    <w:p>
+      <w:r>
+        <w:t>This report encapsulates the successful deployment of a Differentially Private synthetic data generation pipeline. The project crafted a sophscientific data preprocessing system, adeptly addressed missing data, and utilized a Diffusion-based generative model guarded by Opacus.</w:t>
+      </w:r>
+    </w:p>
+    <w:p>
+      <w:pPr>
+        <w:pStyle w:val="ListNumber"/>
+      </w:pPr>
+      <w:r>
+        <w:t>2. Utility &amp; Privacy Evaluation (Phase 8)</w:t>
+      </w:r>
+    </w:p>
+    <w:p>
+      <w:r>
         <w:t>During the comprehensive training process on Kaggle, the generative models faced an anticipated hiccup with Diffusion-based generative models, where DP-SGD led to Exploding Gradients, culminating in Model Collapse (NaN Loss).</w:t>
-        <w:br/>
-        <w:br/>
+      </w:r>
+    </w:p>
+    <w:p>
+      <w:r>
         <w:t>Upon examining these collapsed models against the genuine dataset:</w:t>
-        <w:br/>
-        <w:t>- **Utility Score (Correlation RMSE):** The score defaulted to a maximum error. This failure stemmed from the model's inability to grasp the marginal distributions because the gradients grew too quickly.</w:t>
-        <w:br/>
-        <w:t>- **Privacy Score (MIA Risk):** 0.0 (Pristine Privacy). The models output random noise or NaNs, making it mathematically impossible for an attacker to execute a Membership Inference Attack.</w:t>
-        <w:br/>
-        <w:br/>
+      </w:r>
+    </w:p>
+    <w:p>
+      <w:r>
+        <w:t>Utility Score (Correlation RMSE): The score defaulted to a maximum error. This failure stemmed from the model's inability to grasp the marginal distributions because the gradients grew too quickly.</w:t>
+      </w:r>
+    </w:p>
+    <w:p>
+      <w:r>
+        <w:t>Privacy Score (MIA Risk): 0.0 (Pristine Privacy). The models output random noise or NaNs, making it mathematically impossible for an attacker to execute a Membership Inference Attack.</w:t>
+      </w:r>
+    </w:p>
+    <w:p>
+      <w:r>
         <w:t>This case underscores the typical DP-SGD Privacy-Utility Tradeoff: introducing strict gradient clipping and noise addition (Epsilon) secures privacy but may destabilize the training of high-dimensional deep learning networks.</w:t>
-        <w:br/>
-        <w:br/>
-        <w:t>## 3. Red-Team Verification (Phase 9)</w:t>
-        <w:br/>
-        <w:br/>
+      </w:r>
+    </w:p>
+    <w:p>
+      <w:pPr>
+        <w:pStyle w:val="ListNumber"/>
+      </w:pPr>
+      <w:r>
+        <w:t>3. Red-Team Verification (Phase 9)</w:t>
+      </w:r>
+    </w:p>
+    <w:p>
+      <w:r>
         <w:t>Despite the utility collapse, the pipeline's security components proved to be top-notch:</w:t>
-        <w:br/>
-        <w:t>- **HIPAA Sanitization:** Completed with flying colors. Patient identifiers (`encounter_id`, `patient_nbr`) were identified and eliminated prior to model training.</w:t>
-        <w:br/>
-        <w:t>- **Row Memorization:** Detected no exact matches between the original data and the synthetic outcomes, confirming that the privacy safeguards (and consequent utility crash) completely thwart data leakage.</w:t>
-        <w:br/>
-        <w:br/>
-        <w:t>## 4. Conclusion &amp; Next Steps</w:t>
-        <w:br/>
-        <w:br/>
+      </w:r>
+    </w:p>
+    <w:p>
+      <w:r>
+        <w:t>HIPAA Sanitization: Completed with flying colors. Patient identifiers (`encounter_id`, `patient_nbr`) were identified and eliminated prior to model training.</w:t>
+      </w:r>
+    </w:p>
+    <w:p>
+      <w:r>
+        <w:t>Row Memorization: Detected no exact matches between the original data and the synthetic outcomes, confirming that the privacy safeguards (and consequent utility crash) completely thwart data leakage.</w:t>
+      </w:r>
+    </w:p>
+    <w:p>
+      <w:pPr>
+        <w:pStyle w:val="ListNumber"/>
+      </w:pPr>
+      <w:r>
+        <w:t>4. Conclusion &amp; Next Steps</w:t>
+      </w:r>
+    </w:p>
+    <w:p>
+      <w:r>
         <w:t>The pipeline is fully operational and architecturally solid from start to finish. The remaining obstacle is to fine-tune the optimization hyperparameters (Learning Rate, Clip Norm, Noise Multiplier, and Batch Size) to make the DP-SGD training process more stable.</w:t>
-        <w:br/>
+      </w:r>
+    </w:p>
+    <w:p>
+      <w:r>
         <w:t>In future, we advise switching the generative backend from Diffusion to a straightforward tabular GAN for better stability when maintaining strict privacy budgets. Also, replacing the standard Adam optimizer with a DP-tuned RMSProp could bring more stability to the DP-SGD training loop.</w:t>
       </w:r>
     </w:p>
@@ -420,6 +467,10 @@
     <w:name w:val="Normal"/>
     <w:qFormat/>
     <w:rsid w:val="00FC693F"/>
+    <w:rPr>
+      <w:rFonts w:ascii="Arial" w:hAnsi="Arial"/>
+      <w:sz w:val="22"/>
+    </w:rPr>
   </w:style>
   <w:style w:type="paragraph" w:styleId="Header">
     <w:name w:val="header"/>

</xml_diff>